<commit_message>
Limpeza: corrige problemas de robustez e precisão do processador
- Planilha das Abas 2 e 3 escolhida num seletor do menu lateral (sobrevive a
  recarregar a página e aceita planilhas antigas ou editadas no Excel)
- Distribuição equilibrada entre a equipe; equipe vazia não quebra mais
- Leitura única da coluna PÁGINAS (vírgula, ponto e vírgula, espaço ou número)
  e da coluna DATA (texto ou data do Excel)
- Aba 1 marca a página só quando cargo e ação estão na mesma portaria,
  incluindo portarias que continuam na página seguinte
- Aba 4: blocos cortados apenas em "PORTARIA" no início da linha; matrícula
  exige ao menos 4 dígitos; PDFs com erro passam a ser listados
- Arquivos gerados e caminhos relativos ancorados na pasta do app.py
- Aba 2 não sobrescreve páginas já separadas (opção para sobrescrever)
- Iniciar.bat sincroniza as bibliotecas a cada execução; streamlit>=1.50
- Manual atualizado

Co-Authored-By: Claude Opus 5.5 <noreply@anthropic.com>
</commit_message>
<xml_diff>
--- a/MANUAL.docx
+++ b/MANUAL.docx
@@ -44,15 +44,7 @@
         <w:t>Processador de DJE</w:t>
       </w:r>
       <w:r>
-        <w:t xml:space="preserve"> é uma ferramenta criada para automatizar o trabalho diário com o Diário da Justiça Eletrônico (DJE). Ele lê os arquivos em PDF, encontra exatamente as páginas onde há portarias de cargos (CAI, DAI, DAS) e ações administrativas (nomeações, </w:t>
-      </w:r>
-      <w:proofErr w:type="gramStart"/>
-      <w:r>
-        <w:t>exonerações, etc.</w:t>
-      </w:r>
-      <w:proofErr w:type="gramEnd"/>
-      <w:r>
-        <w:t>), recorta essas páginas, divide o trabalho entre a equipe e extrai os textos finais.</w:t>
+        <w:t xml:space="preserve"> é uma ferramenta criada para automatizar o trabalho diário com o Diário da Justiça Eletrônico (DJE). Ele lê os arquivos em PDF, encontra exatamente as páginas onde há portarias de cargos (CAI, DAI, DAS) e ações administrativas (nomeações, exonerações, etc.), recorta essas páginas, divide o trabalho entre a equipe e extrai os textos finais.</w:t>
       </w:r>
     </w:p>
     <w:p>
@@ -77,35 +69,12 @@
     </w:p>
     <w:p>
       <w:r>
-        <w:t>Para abrir o sistema, você</w:t>
-      </w:r>
-      <w:r>
-        <w:t xml:space="preserve"> precisa</w:t>
-      </w:r>
-      <w:r>
-        <w:t xml:space="preserve"> </w:t>
-      </w:r>
-      <w:r>
-        <w:t xml:space="preserve">ter </w:t>
-      </w:r>
-      <w:r>
-        <w:t>instala</w:t>
-      </w:r>
-      <w:r>
-        <w:t>do o Python</w:t>
-      </w:r>
-      <w:r>
-        <w:t>:</w:t>
-      </w:r>
-    </w:p>
-    <w:p>
-      <w:proofErr w:type="gramStart"/>
-      <w:r>
-        <w:t>1 .</w:t>
-      </w:r>
-      <w:proofErr w:type="gramEnd"/>
-      <w:r>
-        <w:t xml:space="preserve"> Acesse o link </w:t>
+        <w:t xml:space="preserve">Para abrir o sistema, você precisa ter instalado o Python:</w:t>
+      </w:r>
+    </w:p>
+    <w:p>
+      <w:r>
+        <w:t xml:space="preserve">1 . Acesse o link </w:t>
       </w:r>
       <w:hyperlink r:id="rId5" w:history="1">
         <w:r>
@@ -163,20 +132,8 @@
     <w:p>
       <w:r>
         <w:lastRenderedPageBreak/>
-        <w:t>3.Execute e depois vá em “</w:t>
-      </w:r>
-      <w:proofErr w:type="spellStart"/>
-      <w:r>
-        <w:t>Launch</w:t>
-      </w:r>
-      <w:proofErr w:type="spellEnd"/>
-      <w:r>
-        <w:t xml:space="preserve"> Python”:</w:t>
-      </w:r>
-      <w:r>
+        <w:t xml:space="preserve">3.Execute e depois vá em “Launch Python”:</w:t>
         <w:br/>
-      </w:r>
-      <w:r>
         <w:drawing>
           <wp:inline distT="0" distB="0" distL="0" distR="0" wp14:anchorId="169B8891" wp14:editId="4D029838">
             <wp:extent cx="4019550" cy="3020807"/>
@@ -222,13 +179,7 @@
     <w:p/>
     <w:p>
       <w:r>
-        <w:t>Após a instalação</w:t>
-      </w:r>
-      <w:r>
-        <w:t xml:space="preserve"> do Python</w:t>
-      </w:r>
-      <w:r>
-        <w:t>:</w:t>
+        <w:t xml:space="preserve">Após a instalação do Python:</w:t>
       </w:r>
     </w:p>
     <w:p>
@@ -239,13 +190,7 @@
         </w:numPr>
       </w:pPr>
       <w:r>
-        <w:t xml:space="preserve">Vá até a pasta onde </w:t>
-      </w:r>
-      <w:r>
-        <w:t>este manual</w:t>
-      </w:r>
-      <w:r>
-        <w:t xml:space="preserve"> está salvo no seu computador.</w:t>
+        <w:t xml:space="preserve">Vá até a pasta onde este manual está salvo no seu computador.</w:t>
       </w:r>
     </w:p>
     <w:p>
@@ -277,18 +222,7 @@
         </w:numPr>
       </w:pPr>
       <w:r>
-        <w:t>Uma tela preta (terminal) vai abrir rapidamente carregando algumas informações. Apenas aguarde.</w:t>
-      </w:r>
-      <w:r>
-        <w:t xml:space="preserve"> Se pedir algum e-mail, apenas tecle </w:t>
-      </w:r>
-      <w:proofErr w:type="spellStart"/>
-      <w:r>
-        <w:t>Enter</w:t>
-      </w:r>
-      <w:proofErr w:type="spellEnd"/>
-      <w:r>
-        <w:t>.</w:t>
+        <w:t xml:space="preserve">Uma tela preta (terminal) vai abrir rapidamente carregando algumas informações. Apenas aguarde. Se pedir algum e-mail, apenas tecle Enter.</w:t>
       </w:r>
     </w:p>
     <w:p>
@@ -299,15 +233,7 @@
         </w:numPr>
       </w:pPr>
       <w:r>
-        <w:t xml:space="preserve">O seu navegador de internet (Chrome, </w:t>
-      </w:r>
-      <w:proofErr w:type="gramStart"/>
-      <w:r>
-        <w:t>Edge, etc.</w:t>
-      </w:r>
-      <w:proofErr w:type="gramEnd"/>
-      <w:r>
-        <w:t>) abrirá automaticamente a tela do sistema.</w:t>
+        <w:t xml:space="preserve">O seu navegador de internet (Chrome, Edge, etc.) abrirá automaticamente a tela do sistema.</w:t>
       </w:r>
     </w:p>
     <w:p>
@@ -345,35 +271,7 @@
         <w:t>Menu Lateral (Esquerda):</w:t>
       </w:r>
       <w:r>
-        <w:t xml:space="preserve"> É onde ficam as configurações. Aqui você diz ao sistema onde estão os </w:t>
-      </w:r>
-      <w:proofErr w:type="spellStart"/>
-      <w:r>
-        <w:t>PDFs</w:t>
-      </w:r>
-      <w:proofErr w:type="spellEnd"/>
-      <w:r>
-        <w:t xml:space="preserve"> originais</w:t>
-      </w:r>
-      <w:r>
-        <w:t xml:space="preserve"> (</w:t>
-      </w:r>
-      <w:proofErr w:type="spellStart"/>
-      <w:r>
-        <w:t>DOs</w:t>
-      </w:r>
-      <w:proofErr w:type="spellEnd"/>
-      <w:r>
-        <w:t>)</w:t>
-      </w:r>
-      <w:r>
-        <w:t>, onde ele deve salvar os recortes e quem são as pessoas da equipe que vão</w:t>
-      </w:r>
-      <w:r>
-        <w:t xml:space="preserve"> conferir</w:t>
-      </w:r>
-      <w:r>
-        <w:t>.</w:t>
+        <w:t xml:space="preserve"> É onde ficam as configurações. Aqui você diz ao sistema onde estão os PDFs originais (DOs), onde ele deve salvar os recortes, qual planilha de índice usar e quem são as pessoas da equipe que vão conferir.</w:t>
       </w:r>
     </w:p>
     <w:p>
@@ -391,13 +289,7 @@
         <w:t>Área Central (Direita):</w:t>
       </w:r>
       <w:r>
-        <w:t xml:space="preserve"> É onde </w:t>
-      </w:r>
-      <w:r>
-        <w:t>o processamento</w:t>
-      </w:r>
-      <w:r>
-        <w:t xml:space="preserve"> acontece. Ela é dividida em </w:t>
+        <w:t xml:space="preserve"> É onde o processamento acontece. Ela é dividida em </w:t>
       </w:r>
       <w:r>
         <w:rPr>
@@ -450,27 +342,7 @@
         <w:t>O que faz:</w:t>
       </w:r>
       <w:r>
-        <w:t xml:space="preserve"> O sistema vai ler todos os </w:t>
-      </w:r>
-      <w:proofErr w:type="spellStart"/>
-      <w:r>
-        <w:t>PDFs</w:t>
-      </w:r>
-      <w:proofErr w:type="spellEnd"/>
-      <w:r>
-        <w:t xml:space="preserve"> completos do DJE e criar uma planilha do </w:t>
-      </w:r>
-      <w:r>
-        <w:t>Excel dizendo</w:t>
-      </w:r>
-      <w:r>
-        <w:t xml:space="preserve"> em qual página está cada portaria</w:t>
-      </w:r>
-      <w:r>
-        <w:t xml:space="preserve"> relevante</w:t>
-      </w:r>
-      <w:r>
-        <w:t>.</w:t>
+        <w:t xml:space="preserve"> O sistema vai ler todos os PDFs completos do DJE e criar uma planilha do Excel dizendo em qual página está cada portaria relevante.</w:t>
       </w:r>
     </w:p>
     <w:p>
@@ -481,15 +353,7 @@
         </w:numPr>
       </w:pPr>
       <w:r>
-        <w:t xml:space="preserve">Coloque os </w:t>
-      </w:r>
-      <w:proofErr w:type="spellStart"/>
-      <w:r>
-        <w:t>PDFs</w:t>
-      </w:r>
-      <w:proofErr w:type="spellEnd"/>
-      <w:r>
-        <w:t xml:space="preserve"> baixados do DJE na pasta DO (ou na pasta que você configurou no menu lateral).</w:t>
+        <w:t xml:space="preserve">Coloque os PDFs baixados do DJE na pasta DO (ou na pasta que você configurou no menu lateral).</w:t>
       </w:r>
     </w:p>
     <w:p>
@@ -569,27 +433,7 @@
         <w:t>Nota de Segurança:</w:t>
       </w:r>
       <w:r>
-        <w:t xml:space="preserve"> O sistema criará um arquivo de Excel com a data e a hora exatas no nome (</w:t>
-      </w:r>
-      <w:proofErr w:type="spellStart"/>
-      <w:r>
-        <w:t>Ex</w:t>
-      </w:r>
-      <w:proofErr w:type="spellEnd"/>
-      <w:r>
-        <w:t xml:space="preserve">: </w:t>
-      </w:r>
-      <w:r>
-        <w:t>“</w:t>
-      </w:r>
-      <w:r>
-        <w:t>DO-exp_Processado_Agrupado_20260711_123000.xlsx</w:t>
-      </w:r>
-      <w:r>
-        <w:t>”</w:t>
-      </w:r>
-      <w:r>
-        <w:t>). Isso garante que você nunca perca dados antigos. O sistema já memoriza esse arquivo novo para os próximos passos automaticamente.</w:t>
+        <w:t xml:space="preserve"> O sistema criará um arquivo de Excel com a data e a hora exatas no nome (Ex: “DO-exp_Processado_Agrupado_20260711_123000.xlsx”). Isso garante que você nunca perca dados antigos. O sistema já seleciona esse arquivo novo para os próximos passos automaticamente, mesmo que a página do navegador seja recarregada. Para usar outra planilha (uma mais antiga, ou uma corrigida à mão no Excel), escolha-a no campo “Planilha usada nas Abas 2 e 3” do menu lateral. Ela precisa estar na mesma pasta do sistema.</w:t>
       </w:r>
     </w:p>
     <w:p>
@@ -616,21 +460,7 @@
         <w:t>O que faz:</w:t>
       </w:r>
       <w:r>
-        <w:t xml:space="preserve"> Usando a planilha gerada no Passo 1, o sistema recorta apenas as páginas </w:t>
-      </w:r>
-      <w:r>
-        <w:t>separadas</w:t>
-      </w:r>
-      <w:r>
-        <w:t xml:space="preserve"> e as organiza em pastas por data (</w:t>
-      </w:r>
-      <w:proofErr w:type="spellStart"/>
-      <w:r>
-        <w:t>Ex</w:t>
-      </w:r>
-      <w:proofErr w:type="spellEnd"/>
-      <w:r>
-        <w:t>: pasta "08 MAIO").</w:t>
+        <w:t xml:space="preserve"> Usando a planilha gerada no Passo 1, o sistema recorta apenas as páginas separadas e as organiza em pastas por data (Ex: pasta "08 MAIO").</w:t>
       </w:r>
     </w:p>
     <w:p>
@@ -662,31 +492,7 @@
         </w:numPr>
       </w:pPr>
       <w:r>
-        <w:t xml:space="preserve">Verifique se no menu lateral a "Pasta dos </w:t>
-      </w:r>
-      <w:proofErr w:type="spellStart"/>
-      <w:r>
-        <w:t>PDFs</w:t>
-      </w:r>
-      <w:proofErr w:type="spellEnd"/>
-      <w:r>
-        <w:t xml:space="preserve"> Separados" está correta (o padrão </w:t>
-      </w:r>
-      <w:proofErr w:type="gramStart"/>
-      <w:r>
-        <w:t>é .</w:t>
-      </w:r>
-      <w:proofErr w:type="gramEnd"/>
-      <w:r>
-        <w:t>/</w:t>
-      </w:r>
-      <w:proofErr w:type="spellStart"/>
-      <w:r>
-        <w:t>DJE_Separados</w:t>
-      </w:r>
-      <w:proofErr w:type="spellEnd"/>
-      <w:r>
-        <w:t>). Se as pastas dos dias não existirem, o sistema criará sozinho.</w:t>
+        <w:t xml:space="preserve">Verifique se no menu lateral a "Pasta dos PDFs Separados" está correta (o padrão é ./DJE_Separados). Se as pastas dos dias não existirem, o sistema criará sozinho. Páginas que já foram separadas antes são mantidas; para refazê-las, marque a opção “Sobrescrever páginas já separadas”.</w:t>
       </w:r>
     </w:p>
     <w:p>
@@ -712,47 +518,14 @@
           <w:b/>
           <w:bCs/>
         </w:rPr>
-        <w:t>▶</w:t>
-      </w:r>
-      <w:proofErr w:type="gramStart"/>
-      <w:r>
-        <w:rPr>
-          <w:rFonts w:ascii="Segoe UI Emoji" w:hAnsi="Segoe UI Emoji" w:cs="Segoe UI Emoji"/>
-          <w:b/>
-          <w:bCs/>
-        </w:rPr>
-        <w:t>️</w:t>
-      </w:r>
-      <w:r>
-        <w:rPr>
-          <w:b/>
-          <w:bCs/>
-        </w:rPr>
-        <w:t xml:space="preserve"> Separar</w:t>
-      </w:r>
-      <w:proofErr w:type="gramEnd"/>
-      <w:r>
-        <w:rPr>
-          <w:b/>
-          <w:bCs/>
-        </w:rPr>
-        <w:t xml:space="preserve"> </w:t>
-      </w:r>
-      <w:proofErr w:type="spellStart"/>
-      <w:r>
-        <w:rPr>
-          <w:b/>
-          <w:bCs/>
-        </w:rPr>
-        <w:t>PDFs</w:t>
-      </w:r>
-      <w:proofErr w:type="spellEnd"/>
-      <w:r>
-        <w:rPr>
-          <w:b/>
-          <w:bCs/>
-        </w:rPr>
-        <w:t>"</w:t>
+        <w:t>▶️</w:t>
+      </w:r>
+      <w:r>
+        <w:rPr>
+          <w:b/>
+          <w:bCs/>
+        </w:rPr>
+        <w:t xml:space="preserve"> Separar PDFs"</w:t>
       </w:r>
       <w:r>
         <w:t>.</w:t>
@@ -793,13 +566,7 @@
         <w:t>O que faz:</w:t>
       </w:r>
       <w:r>
-        <w:t xml:space="preserve"> Divide todas as páginas encontradas de forma igual entre os membros da equipe que estão</w:t>
-      </w:r>
-      <w:r>
-        <w:t xml:space="preserve"> conferindo</w:t>
-      </w:r>
-      <w:r>
-        <w:t>.</w:t>
+        <w:t xml:space="preserve"> Divide todas as páginas encontradas de forma equilibrada (ninguém fica com mais de uma página de diferença) entre os membros da equipe que estão conferindo.</w:t>
       </w:r>
     </w:p>
     <w:p>
@@ -831,36 +598,7 @@
         </w:numPr>
       </w:pPr>
       <w:r>
-        <w:t>Digite o nome de quem está</w:t>
-      </w:r>
-      <w:r>
-        <w:t xml:space="preserve"> conferindo</w:t>
-      </w:r>
-      <w:r>
-        <w:t>, um por linha (</w:t>
-      </w:r>
-      <w:proofErr w:type="spellStart"/>
-      <w:r>
-        <w:t>Ex</w:t>
-      </w:r>
-      <w:proofErr w:type="spellEnd"/>
-      <w:r>
-        <w:t>: Álvaro, Sidnei, Catiane, Fred). Se alguém</w:t>
-      </w:r>
-      <w:r>
-        <w:t xml:space="preserve"> entrar ou sair da conferência</w:t>
-      </w:r>
-      <w:r>
-        <w:t>, é só apagar</w:t>
-      </w:r>
-      <w:r>
-        <w:t xml:space="preserve"> ou adicionar</w:t>
-      </w:r>
-      <w:r>
-        <w:t xml:space="preserve"> o nome</w:t>
-      </w:r>
-      <w:r>
-        <w:t xml:space="preserve"> que o cálculo é refeito sozinho.</w:t>
+        <w:t xml:space="preserve">Digite o nome de quem está conferindo, um por linha (Ex: Álvaro, Sidnei, Catiane, Fred). Se alguém entrar ou sair da conferência, é só apagar ou adicionar o nome que o cálculo é refeito sozinho.</w:t>
       </w:r>
     </w:p>
     <w:p>
@@ -928,10 +666,7 @@
         </w:numPr>
       </w:pPr>
       <w:r>
-        <w:t>O sistema mostrará na tela uma lista exata informando quais dias e páginas cada pessoa deve revisar. Você pode copiar esse texto</w:t>
-      </w:r>
-      <w:r>
-        <w:t>.</w:t>
+        <w:t>O sistema mostrará na tela uma lista exata informando quais dias e páginas cada pessoa deve revisar. Você pode copiar esse texto.</w:t>
       </w:r>
     </w:p>
     <w:p>
@@ -969,21 +704,7 @@
         <w:t>Requisitados</w:t>
       </w:r>
       <w:r>
-        <w:t xml:space="preserve">. O sistema lê novamente os </w:t>
-      </w:r>
-      <w:proofErr w:type="spellStart"/>
-      <w:r>
-        <w:t>PDFs</w:t>
-      </w:r>
-      <w:proofErr w:type="spellEnd"/>
-      <w:r>
-        <w:t xml:space="preserve"> e copia o texto literal das portarias que contêm matrículas iniciadas com o número "5".</w:t>
-      </w:r>
-      <w:r>
-        <w:t xml:space="preserve"> Devem ser verificadas para </w:t>
-      </w:r>
-      <w:r>
-        <w:t>serem de fato requisitados.</w:t>
+        <w:t xml:space="preserve">. O sistema lê novamente os PDFs e copia o texto literal das portarias que contêm matrículas iniciadas com o número "5". Devem ser verificadas para serem de fato requisitados.</w:t>
       </w:r>
     </w:p>
     <w:p>
@@ -1062,10 +783,7 @@
         </w:numPr>
       </w:pPr>
       <w:r>
-        <w:t xml:space="preserve">O arquivo é baixado automaticamente. </w:t>
-      </w:r>
-      <w:r>
-        <w:t xml:space="preserve">Clique no botão </w:t>
+        <w:t xml:space="preserve">Quando o processamento terminar, clique no botão </w:t>
       </w:r>
       <w:r>
         <w:rPr>
@@ -1087,20 +805,10 @@
           <w:b/>
           <w:bCs/>
         </w:rPr>
-        <w:t xml:space="preserve"> Baixar Portarias Consolidadas (TXT)"</w:t>
-      </w:r>
-      <w:r>
-        <w:rPr>
-          <w:b/>
-          <w:bCs/>
-        </w:rPr>
-        <w:t xml:space="preserve">, </w:t>
-      </w:r>
-      <w:r>
-        <w:t>se precisar baixar novamente</w:t>
-      </w:r>
-      <w:r>
-        <w:t>.</w:t>
+        <w:t xml:space="preserve"> Baixar Portarias Consolidadas (TXT)", </w:t>
+      </w:r>
+      <w:r>
+        <w:t>para baixar o arquivo. Uma cópia também fica salva na pasta do sistema.</w:t>
       </w:r>
     </w:p>
     <w:p>
@@ -1111,42 +819,7 @@
         </w:numPr>
       </w:pPr>
       <w:r>
-        <w:t xml:space="preserve">As APOSTILAS ainda precisam ser manualmente </w:t>
-      </w:r>
-      <w:proofErr w:type="gramStart"/>
-      <w:r>
-        <w:t>pesquisadas nos</w:t>
-      </w:r>
-      <w:proofErr w:type="gramEnd"/>
-      <w:r>
-        <w:t xml:space="preserve"> </w:t>
-      </w:r>
-      <w:proofErr w:type="spellStart"/>
-      <w:r>
-        <w:t>DOs</w:t>
-      </w:r>
-      <w:proofErr w:type="spellEnd"/>
-      <w:r>
-        <w:t xml:space="preserve">. Para tal, unifique todos os </w:t>
-      </w:r>
-      <w:proofErr w:type="spellStart"/>
-      <w:r>
-        <w:t>PDFs</w:t>
-      </w:r>
-      <w:proofErr w:type="spellEnd"/>
-      <w:r>
-        <w:t xml:space="preserve"> na íntegra do período de busca com o </w:t>
-      </w:r>
-      <w:r>
-        <w:t xml:space="preserve">programa </w:t>
-      </w:r>
-      <w:proofErr w:type="spellStart"/>
-      <w:r>
-        <w:t>PDFSam</w:t>
-      </w:r>
-      <w:proofErr w:type="spellEnd"/>
-      <w:r>
-        <w:t xml:space="preserve"> e utilize a pesquisa avançada no Adobe Acrobat.</w:t>
+        <w:t xml:space="preserve">As APOSTILAS ainda precisam ser manualmente pesquisadas nos DOs. Para tal, unifique todos os PDFs na íntegra do período de busca com o programa PDFSam e utilize a pesquisa avançada no Adobe Acrobat.</w:t>
       </w:r>
     </w:p>
     <w:p>
@@ -1179,7 +852,7 @@
         <w:t>A aba 2 ou 3 deu erro de "Planilha não encontrada":</w:t>
       </w:r>
       <w:r>
-        <w:t xml:space="preserve"> Isso significa que você pulou o Passo 1. O sistema precisa criar o Excel no Passo 1 antes de conseguir separar as páginas ou distribuir o trabalho.</w:t>
+        <w:t xml:space="preserve"> Isso significa que ainda não existe nenhuma planilha na pasta do sistema (você pulou o Passo 1). Execute o Passo 1 para criar o Excel antes de separar as páginas ou distribuir o trabalho.</w:t>
       </w:r>
     </w:p>
     <w:p>
@@ -1197,15 +870,7 @@
         <w:t>O sistema "travou":</w:t>
       </w:r>
       <w:r>
-        <w:t xml:space="preserve"> Se você estiver processando </w:t>
-      </w:r>
-      <w:proofErr w:type="spellStart"/>
-      <w:r>
-        <w:t>PDFs</w:t>
-      </w:r>
-      <w:proofErr w:type="spellEnd"/>
-      <w:r>
-        <w:t xml:space="preserve"> muito grandes, pode parecer que o sistema travou, mas observe no canto superior direito do navegador se há um ícone escrito "Running" ou uma animação. Apenas aguarde.</w:t>
+        <w:t xml:space="preserve"> Se você estiver processando PDFs muito grandes, pode parecer que o sistema travou, mas observe no canto superior direito do navegador se há um ícone escrito "Running" ou uma animação. Apenas aguarde.</w:t>
       </w:r>
     </w:p>
     <w:p/>

</xml_diff>

<commit_message>
Indexação passa a avaliar apostilas e "tornar sem efeito"
- Novo módulo analise_dje.py com a leitura e análise do texto do DJE
- Texto dividido em atos (portaria, apostila, decisão, aviso...) pelo título
  e pela linha "id:" do DJERJ; só portarias entram na busca de cargo/função,
  eliminando falsos positivos vindos de decisões
- Apostila conta quando altera portaria de cargo/função mudando a data
  "a contar" ou o símbolo, ou quando a torna sem efeito; quando o texto não
  basta, a portaria original é buscada nas pastas DO e Acervo e comparada
- Trechos que o PDF traz desenhados (sem texto) são marcados como ilegíveis
- Casos não confirmados entram no índice e na coluna PÁGINAS A VERIFICAR
- Planilha ganha a aba "Detalhes" com resultado, motivo e referência
- Aba 4 passa a considerar apenas atos do tipo portaria
- Manual atualizado

Co-Authored-By: Claude Opus 5.5 <noreply@anthropic.com>
</commit_message>
<xml_diff>
--- a/MANUAL.docx
+++ b/MANUAL.docx
@@ -271,7 +271,7 @@
         <w:t>Menu Lateral (Esquerda):</w:t>
       </w:r>
       <w:r>
-        <w:t xml:space="preserve"> É onde ficam as configurações. Aqui você diz ao sistema onde estão os PDFs originais (DOs), onde ele deve salvar os recortes, qual planilha de índice usar e quem são as pessoas da equipe que vão conferir.</w:t>
+        <w:t xml:space="preserve"> É onde ficam as configurações. Aqui você diz ao sistema onde estão os PDFs originais (DOs), onde ele deve salvar os recortes, onde fica o acervo de DJEs anteriores, qual planilha de índice usar e quem são as pessoas da equipe que vão conferir.</w:t>
       </w:r>
     </w:p>
     <w:p>
@@ -342,7 +342,7 @@
         <w:t>O que faz:</w:t>
       </w:r>
       <w:r>
-        <w:t xml:space="preserve"> O sistema vai ler todos os PDFs completos do DJE e criar uma planilha do Excel dizendo em qual página está cada portaria relevante.</w:t>
+        <w:t xml:space="preserve"> O sistema vai ler todos os PDFs completos do DJE e criar uma planilha do Excel dizendo em qual página está cada portaria relevante e cada apostila (ou ato que torna portaria sem efeito) com efeito financeiro.</w:t>
       </w:r>
     </w:p>
     <w:p>
@@ -437,6 +437,42 @@
       </w:r>
     </w:p>
     <w:p>
+      <w:r>
+        <w:rPr>
+          <w:b/>
+          <w:bCs/>
+        </w:rPr>
+        <w:t>Apostilas:</w:t>
+      </w:r>
+      <w:r>
+        <w:t xml:space="preserve"> O sistema também encontra as APOSTILAS (ou APOSTILAMENTOS) e os atos que tornam portarias sem efeito. A página só conta quando a apostila altera uma portaria de cargo/função (CAI, DAI, DAS) mudando a data “a contar” ou o símbolo, ou quando cancela essa portaria. Correções de nome, matrícula, lotação, remoção, horário ou cargo efetivo não contam. Decisões também não contam, mesmo que citem cargos.</w:t>
+      </w:r>
+    </w:p>
+    <w:p>
+      <w:r>
+        <w:rPr>
+          <w:b/>
+          <w:bCs/>
+        </w:rPr>
+        <w:t>Pasta do Acervo:</w:t>
+      </w:r>
+      <w:r>
+        <w:t xml:space="preserve"> Quando a apostila não deixa claro o que mudou, o sistema abre o DJE em que a portaria original foi publicada e compara as datas “a contar” e os símbolos. Para isso, guarde os DJEs de datas anteriores na pasta Acervo (configurável no menu lateral), com o mesmo padrão de nome dos arquivos da pasta DO (começando pela data, AAAAMMDD).</w:t>
+      </w:r>
+    </w:p>
+    <w:p>
+      <w:r>
+        <w:rPr>
+          <w:b/>
+          <w:bCs/>
+        </w:rPr>
+        <w:t>Páginas a verificar:</w:t>
+      </w:r>
+      <w:r>
+        <w:t xml:space="preserve"> Se não for possível confirmar (DJE original fora do Acervo, portaria não localizada ou trecho da apostila ilegível no PDF), a página entra no índice mesmo assim e aparece também na coluna “PÁGINAS A VERIFICAR”. A aba “Detalhes” da planilha mostra, para cada portaria e apostila, o resultado (CONTA, NÃO CONTA ou VERIFICAR), o motivo e a portaria original consultada. “VERIFICAR (dispensável)” indica que a página já conta por outro ato.</w:t>
+      </w:r>
+    </w:p>
+    <w:p>
       <w:pPr>
         <w:rPr>
           <w:b/>
@@ -819,7 +855,7 @@
         </w:numPr>
       </w:pPr>
       <w:r>
-        <w:t xml:space="preserve">As APOSTILAS ainda precisam ser manualmente pesquisadas nos DOs. Para tal, unifique todos os PDFs na íntegra do período de busca com o programa PDFSam e utilize a pesquisa avançada no Adobe Acrobat.</w:t>
+        <w:t xml:space="preserve">Esta aba não inclui as APOSTILAS de requisitados: elas ainda precisam ser pesquisadas manualmente. A aba “Detalhes” da planilha do Passo 1 lista todas as apostilas encontradas, com data, página e trecho, o que ajuda na busca. Se preferir, unifique todos os PDFs na íntegra do período de busca com o programa PDFSam e utilize a pesquisa avançada no Adobe Acrobat.</w:t>
       </w:r>
     </w:p>
     <w:p>
@@ -871,6 +907,24 @@
       </w:r>
       <w:r>
         <w:t xml:space="preserve"> Se você estiver processando PDFs muito grandes, pode parecer que o sistema travou, mas observe no canto superior direito do navegador se há um ícone escrito "Running" ou uma animação. Apenas aguarde.</w:t>
+      </w:r>
+    </w:p>
+    <w:p>
+      <w:pPr>
+        <w:numPr>
+          <w:ilvl w:val="0"/>
+          <w:numId w:val="7"/>
+        </w:numPr>
+      </w:pPr>
+      <w:r>
+        <w:rPr>
+          <w:b/>
+          <w:bCs/>
+        </w:rPr>
+        <w:t>Aparece “⟦trecho ilegível⟧” no texto:</w:t>
+      </w:r>
+      <w:r>
+        <w:t xml:space="preserve"> Alguns trechos do DJE são publicados como desenho, e não como texto, e o sistema não consegue lê-los. Quando isso acontece numa apostila de cargo/função, a página fica “a verificar”: abra o PDF e confira o trecho.</w:t>
       </w:r>
     </w:p>
     <w:p/>

</xml_diff>

<commit_message>
Nova Aba 5: saídas da folha de comissionados e requisitados
- Lista exonerações/dispensas de cargo ou função CAI, DAI, DAS de servidores
  sem vínculo efetivo: "Comissionado"/"exclusivamente comissionado",
  matrícula 4000... ou matrícula de requisitado (5..., mais de 5 dígitos)
- Técnico de Atividade Judiciária, Analista Judiciário, Técnico Judiciário e
  Oficial de Justiça são estáveis e ficam de fora
- Procura renomeação pelo nome (a matrícula pode mudar) no mesmo DJE e nos
  posteriores da pasta DO; citações como "vaga decorrente da exoneração de"
  não contam como renomeação
- Gera planilha (situação e motivo por servidor) e TXT com as portarias
- Texto lido dos PDFs fica em cache, evitando releitura entre as abas
- Manual atualizado com o Passo 5

Co-Authored-By: Claude Opus 5.5 <noreply@anthropic.com>
</commit_message>
<xml_diff>
--- a/MANUAL.docx
+++ b/MANUAL.docx
@@ -296,10 +296,10 @@
           <w:b/>
           <w:bCs/>
         </w:rPr>
-        <w:t>4 Abas (Passos)</w:t>
-      </w:r>
-      <w:r>
-        <w:t xml:space="preserve"> numeradas. Você deve executar uma aba por vez, da 1 até a 4.</w:t>
+        <w:t>5 Abas (Passos)</w:t>
+      </w:r>
+      <w:r>
+        <w:t xml:space="preserve"> numeradas. Você deve executar uma aba por vez, da 1 até a 4. A aba 5 é independente e pode ser usada a qualquer momento.</w:t>
       </w:r>
     </w:p>
     <w:p>
@@ -856,6 +856,81 @@
       </w:pPr>
       <w:r>
         <w:t xml:space="preserve">Esta aba não inclui as APOSTILAS de requisitados: elas ainda precisam ser pesquisadas manualmente. A aba “Detalhes” da planilha do Passo 1 lista todas as apostilas encontradas, com data, página e trecho, o que ajuda na busca. Se preferir, unifique todos os PDFs na íntegra do período de busca com o programa PDFSam e utilize a pesquisa avançada no Adobe Acrobat.</w:t>
+      </w:r>
+    </w:p>
+    <w:p>
+      <w:pPr>
+        <w:rPr>
+          <w:b/>
+          <w:bCs/>
+        </w:rPr>
+      </w:pPr>
+      <w:r>
+        <w:rPr>
+          <w:b/>
+          <w:bCs/>
+        </w:rPr>
+        <w:t>Passo 5: Saídas da Folha (Comissionados)</w:t>
+      </w:r>
+    </w:p>
+    <w:p>
+      <w:r>
+        <w:rPr>
+          <w:b/>
+          <w:bCs/>
+        </w:rPr>
+        <w:t>O que faz:</w:t>
+      </w:r>
+      <w:r>
+        <w:t xml:space="preserve"> Lista as exonerações e dispensas de cargo/função (CAI, DAI, DAS) de servidores que não têm vínculo efetivo com o Tribunal e, por isso, saem da folha: os exclusivamente comissionados (texto “Comissionado” ou matrícula iniciada por 4000…) e os requisitados (matrícula iniciada por 5, com mais de 5 dígitos).</w:t>
+      </w:r>
+    </w:p>
+    <w:p>
+      <w:r>
+        <w:rPr>
+          <w:b/>
+          <w:bCs/>
+        </w:rPr>
+        <w:t>Quem não entra:</w:t>
+      </w:r>
+      <w:r>
+        <w:t xml:space="preserve"> Técnicos de Atividade Judiciária, Analistas Judiciários, Técnicos Judiciários e Oficiais de Justiça, que são estáveis e continuam na folha mesmo perdendo o cargo ou a função.</w:t>
+      </w:r>
+    </w:p>
+    <w:p>
+      <w:r>
+        <w:rPr>
+          <w:b/>
+          <w:bCs/>
+        </w:rPr>
+        <w:t>Renomeação:</w:t>
+      </w:r>
+      <w:r>
+        <w:t xml:space="preserve"> Se a mesma pessoa for nomeada ou designada novamente no mesmo DJE ou em um DJE posterior da pasta DO, ela não saiu da folha e aparece como “NÃO SAIU”, com o dia e a página da renomeação. A busca é feita pelo nome, porque a matrícula pode mudar. Renomeações publicadas depois do período que está na pasta DO não são vistas.</w:t>
+      </w:r>
+    </w:p>
+    <w:p>
+      <w:r>
+        <w:rPr>
+          <w:b/>
+          <w:bCs/>
+        </w:rPr>
+        <w:t>Como usar:</w:t>
+      </w:r>
+      <w:r>
+        <w:t xml:space="preserve"> Clique na aba “5. Saídas da Folha” e no botão “▶️ Verificar Saídas da Folha”. O sistema mostra quantos servidores saíram, quantos foram renomeados e quantos precisam de verificação, e gera dois arquivos com data e hora no nome: uma planilha com uma linha por servidor (situação e motivo) e um TXT com o texto das portarias de quem saiu da folha.</w:t>
+      </w:r>
+    </w:p>
+    <w:p>
+      <w:r>
+        <w:rPr>
+          <w:b/>
+          <w:bCs/>
+        </w:rPr>
+        <w:t>Atenção:</w:t>
+      </w:r>
+      <w:r>
+        <w:t xml:space="preserve"> “VERIFICAR” aparece quando o vínculo do servidor não pôde ser identificado no texto, ou quando a portaria exonera uma relação (tabela) de servidores sem renomeá-los. Nesses casos, confira a portaria no PDF.</w:t>
       </w:r>
     </w:p>
     <w:p>

</xml_diff>

<commit_message>
OCR opcional para trechos de PDF desenhados em vez de texto
- Trechos desenhados (comuns em páginas salvas pelo "Imprimir em PDF";
  o DJE original traz texto normal) são lidos com RapidOCR e entram no
  texto entre ⟪ ⟫; a apostila analisada indica que parte veio do OCR
- RapidOCR é carregado só quando aparece um trecho desenhado e é opcional:
  sem ele, o trecho continua marcado como ⟦trecho ilegível⟧
- requirements-ocr.txt separado; Iniciar.bat instala o OCR sem interromper
  a inicialização se a instalação falhar
- Exemplos: Flavia (10/08) passa a CONTA e a apostila de horário (28/08)
  a NÃO CONTA, conforme o gabarito
- Manual atualizado

Co-Authored-By: Claude Opus 5.5 <noreply@anthropic.com>
</commit_message>
<xml_diff>
--- a/MANUAL.docx
+++ b/MANUAL.docx
@@ -996,10 +996,10 @@
           <w:b/>
           <w:bCs/>
         </w:rPr>
-        <w:t>Aparece “⟦trecho ilegível⟧” no texto:</w:t>
-      </w:r>
-      <w:r>
-        <w:t xml:space="preserve"> Alguns trechos do DJE são publicados como desenho, e não como texto, e o sistema não consegue lê-los. Quando isso acontece numa apostila de cargo/função, a página fica “a verificar”: abra o PDF e confira o trecho.</w:t>
+        <w:t>Aparece “⟪…⟫” ou “⟦trecho ilegível⟧” no texto:</w:t>
+      </w:r>
+      <w:r>
+        <w:t xml:space="preserve"> Páginas salvas com o “Imprimir em PDF” do Windows podem ter trechos convertidos em desenho, sem texto. O sistema lê esses trechos por OCR e os mostra entre “⟪ ⟫”; confira-os no PDF. Se o OCR não estiver instalado ou não conseguir ler, aparece “⟦trecho ilegível⟧” e a apostila fica “a verificar”. Para evitar o problema, use sempre os PDFs originais baixados do site do DJE (o DJE original traz texto normal).</w:t>
       </w:r>
     </w:p>
     <w:p/>

</xml_diff>